<commit_message>
Corrected C3 eplanation doc
</commit_message>
<xml_diff>
--- a/D387 - Advanced Java Task C3.docx
+++ b/D387 - Advanced Java Task C3.docx
@@ -29,11 +29,25 @@
       </w:r>
       <w:proofErr w:type="gramStart"/>
       <w:r>
-        <w:t>in order to</w:t>
+        <w:t>In order to</w:t>
       </w:r>
       <w:proofErr w:type="gramEnd"/>
       <w:r>
-        <w:t xml:space="preserve"> deploy this Hotel Reservation application to the cloud, I would first create a Docker image of the application using the </w:t>
+        <w:t xml:space="preserve"> deploy this Hotel Reservation application to the cloud, I would use Amazon Web Services (AWS), specifically Elastic Beanstalk with Docker. </w:t>
+      </w:r>
+      <w:r>
+        <w:t xml:space="preserve"> </w:t>
+      </w:r>
+      <w:r>
+        <w:t xml:space="preserve">First, the application would need to be packaged using Maven to </w:t>
+      </w:r>
+      <w:proofErr w:type="gramStart"/>
+      <w:r>
+        <w:t>generate  the</w:t>
+      </w:r>
+      <w:proofErr w:type="gramEnd"/>
+      <w:r>
+        <w:t xml:space="preserve"> JAR file needed for the Docker container. This can be done by creating a </w:t>
       </w:r>
       <w:proofErr w:type="spellStart"/>
       <w:r>
@@ -41,15 +55,15 @@
       </w:r>
       <w:proofErr w:type="spellEnd"/>
       <w:r>
-        <w:t xml:space="preserve">. Then, I would test the image to ensure all functions were implemented. Once all functions are verified, I would deploy the Docker image to AWS, also testing that all functions were implemented correctly. Once verified, the last </w:t>
-      </w:r>
-      <w:proofErr w:type="gramStart"/>
-      <w:r>
-        <w:t>steps</w:t>
-      </w:r>
-      <w:proofErr w:type="gramEnd"/>
-      <w:r>
-        <w:t xml:space="preserve"> would be to adjust the environment variables and network settings to ensure my application is accessible and maintain security. </w:t>
+        <w:t xml:space="preserve">. Once the image is built, I would test the application locally on port 8080. Once all functions are verified to be working, I would create a repository in Amazon Elastic Container Registry and push the Docker image to the repository in question. Next, I would create a new Elastic Beanstalk environment configured for Docker and connect it to the image stored earlier in the ECR. To ensure access, I would need to confirm that the container exposes port 8080 and inbound HTTP on port 80 is configured properly. Traffic from port 80 would then be routed to the application by Elastic Beanstalk. Once deployed, I would next check that the application is accessible through the AWS URL and test to ensure all functions are accounted for. </w:t>
+      </w:r>
+    </w:p>
+    <w:p>
+      <w:r>
+        <w:t xml:space="preserve">Finally, after ensuring the application is running correctly and all functions are working as intended, I would then need to consider larger aspects such as scaling and load balancing. Fortunately, auto scaling policies will make this aspect easier as it would automatically add or remove EC2 instances based on traffic demand and enable load balancing to ensure that no instance is overloaded with requests. This would ensure that performance and availability is maintained for the application. </w:t>
+      </w:r>
+      <w:r>
+        <w:t xml:space="preserve">Then I would review security group rules, environment variables, and monitor settings to ensure the application remains secure, stable, and responsive under varying conditions. </w:t>
       </w:r>
     </w:p>
     <w:sectPr>
@@ -665,6 +679,7 @@
   <w:style w:type="character" w:default="1" w:styleId="DefaultParagraphFont">
     <w:name w:val="Default Paragraph Font"/>
     <w:uiPriority w:val="1"/>
+    <w:semiHidden/>
     <w:unhideWhenUsed/>
   </w:style>
   <w:style w:type="table" w:default="1" w:styleId="TableNormal">

</xml_diff>

<commit_message>
Modified response, taking into account evaluation comments and instructor guidance after 1 on 1 meeting
</commit_message>
<xml_diff>
--- a/D387 - Advanced Java Task C3.docx
+++ b/D387 - Advanced Java Task C3.docx
@@ -29,11 +29,37 @@
       </w:r>
       <w:proofErr w:type="gramStart"/>
       <w:r>
-        <w:t>in order to</w:t>
+        <w:t>In order to</w:t>
       </w:r>
       <w:proofErr w:type="gramEnd"/>
       <w:r>
-        <w:t xml:space="preserve"> deploy this Hotel Reservation application to the cloud, I would first create a Docker image of the application using the </w:t>
+        <w:t xml:space="preserve"> deploy this Hotel Reservation application to the cloud, I would use Amazon Web Services (AWS), specifically Elastic Beanstalk with Docker. </w:t>
+      </w:r>
+      <w:r>
+        <w:t xml:space="preserve"> </w:t>
+      </w:r>
+      <w:r>
+        <w:t xml:space="preserve">First, the application would need to be </w:t>
+      </w:r>
+      <w:r>
+        <w:t xml:space="preserve">built. The application is built using Angular as the front-end framework and the </w:t>
+      </w:r>
+      <w:proofErr w:type="gramStart"/>
+      <w:r>
+        <w:t>back-end</w:t>
+      </w:r>
+      <w:proofErr w:type="gramEnd"/>
+      <w:r>
+        <w:t xml:space="preserve"> is built using Java and Spring Boot. Once built, the application would need to be packaged into a Docker container which will allow compatibility across platforms. </w:t>
+      </w:r>
+      <w:r>
+        <w:t xml:space="preserve">This can be done </w:t>
+      </w:r>
+      <w:r>
+        <w:t xml:space="preserve">through the utilization of </w:t>
+      </w:r>
+      <w:r>
+        <w:t xml:space="preserve">a </w:t>
       </w:r>
       <w:proofErr w:type="spellStart"/>
       <w:r>
@@ -41,15 +67,20 @@
       </w:r>
       <w:proofErr w:type="spellEnd"/>
       <w:r>
-        <w:t xml:space="preserve">. Then, I would test the image to ensure all functions were implemented. Once all functions are verified, I would deploy the Docker image to AWS, also testing that all functions were implemented correctly. Once verified, the last </w:t>
-      </w:r>
-      <w:proofErr w:type="gramStart"/>
-      <w:r>
-        <w:t>steps</w:t>
-      </w:r>
-      <w:proofErr w:type="gramEnd"/>
-      <w:r>
-        <w:t xml:space="preserve"> would be to adjust the environment variables and network settings to ensure my application is accessible and maintain security. </w:t>
+        <w:t xml:space="preserve">. </w:t>
+      </w:r>
+    </w:p>
+    <w:p>
+      <w:r>
+        <w:t xml:space="preserve">Once the image is built, I would test the application locally on port 8080. Once all functions are verified to be working, I would create a repository in Amazon Elastic Container Registry and push the Docker image to the repository in question. Next, I would create a new Elastic Beanstalk environment configured for Docker and connect it to the image stored earlier in the ECR. To ensure access, I would need to confirm that the container exposes port 8080 and inbound HTTP on port 80 is configured properly. Traffic from port 80 would then be routed to the application by Elastic Beanstalk. Once deployed, I would next check that the application is accessible through the AWS URL and test to ensure all functions are accounted for. </w:t>
+      </w:r>
+    </w:p>
+    <w:p>
+      <w:r>
+        <w:t xml:space="preserve">Finally, after ensuring the application is running correctly and all functions are working as intended, I would then need to consider larger aspects such as scaling and load balancing. Fortunately, auto scaling policies will make this aspect easier as it would automatically add or remove EC2 instances based on traffic demand and enable load balancing to ensure that no instance is overloaded with requests. This would ensure that performance and availability is maintained for the application. </w:t>
+      </w:r>
+      <w:r>
+        <w:t xml:space="preserve">Then I would review security group rules, environment variables, and monitor settings to ensure the application remains secure, stable, and responsive under varying conditions. </w:t>
       </w:r>
     </w:p>
     <w:sectPr>
@@ -665,6 +696,7 @@
   <w:style w:type="character" w:default="1" w:styleId="DefaultParagraphFont">
     <w:name w:val="Default Paragraph Font"/>
     <w:uiPriority w:val="1"/>
+    <w:semiHidden/>
     <w:unhideWhenUsed/>
   </w:style>
   <w:style w:type="table" w:default="1" w:styleId="TableNormal">

</xml_diff>